<commit_message>
Remove original-image references from sample content and downloads
</commit_message>
<xml_diff>
--- a/dist/assets/samples/37449-document.docx
+++ b/dist/assets/samples/37449-document.docx
@@ -24,11 +24,6 @@
     </w:p>
     <w:p>
       <w:r>
-        <w:t xml:space="preserve">Gợi ý quan sát: hãy xem ảnh tổng thể trước, sau đó đối chiếu ảnh chi tiết để nhận ra đường nét, bề mặt men và hoa văn. Ảnh chi tiết là vùng cắt từ ảnh gốc, không phải một lần chụp khác.</w:t>
-      </w:r>
-    </w:p>
-    <w:p>
-      <w:r>
         <w:t xml:space="preserve">Thuyết minh tiếng Việt và video trong bộ tài nguyên này do Bảo tàng số Nét biên soạn cho mục đích học tập. Giọng đọc được tổng hợp bằng eSpeak NG, ngôn ngữ tiếng Việt; video là minh họa tĩnh từ ảnh hiện vật, không phải phim tư liệu lịch sử.</w:t>
       </w:r>
     </w:p>

</xml_diff>